<commit_message>
Fix Lab 4 report
</commit_message>
<xml_diff>
--- a/Задание 4 Python/Лр4_Python_Мавзовин_Пётр_ТКИ341.docx
+++ b/Задание 4 Python/Лр4_Python_Мавзовин_Пётр_ТКИ341.docx
@@ -179,7 +179,6 @@
           <w:b/>
           <w:sz w:val="28"/>
           <w:szCs w:val="28"/>
-          <w:lang w:val="en-US"/>
         </w:rPr>
       </w:pPr>
       <w:r>
@@ -197,7 +196,6 @@
           <w:b/>
           <w:sz w:val="28"/>
           <w:szCs w:val="28"/>
-          <w:lang w:val="en-US"/>
         </w:rPr>
         <w:t>4</w:t>
       </w:r>
@@ -513,7 +511,7 @@
             <w:rPr>
               <w:rFonts w:asciiTheme="minorHAnsi" w:eastAsiaTheme="minorEastAsia" w:hAnsiTheme="minorHAnsi"/>
               <w:noProof/>
-              <w:szCs w:val="28"/>
+              <w:sz w:val="22"/>
               <w:lang w:eastAsia="ru-RU"/>
             </w:rPr>
           </w:pPr>
@@ -538,13 +536,12 @@
             </w:rPr>
             <w:fldChar w:fldCharType="separate"/>
           </w:r>
-          <w:hyperlink w:anchor="_Toc231466059" w:history="1">
+          <w:hyperlink w:anchor="_Toc231478252" w:history="1">
             <w:r>
               <w:rPr>
                 <w:rStyle w:val="a6"/>
                 <w:rFonts w:cs="Times New Roman"/>
                 <w:noProof/>
-                <w:szCs w:val="28"/>
               </w:rPr>
               <w:t xml:space="preserve">Перевод программы из </w:t>
             </w:r>
@@ -553,7 +550,6 @@
                 <w:rStyle w:val="a6"/>
                 <w:rFonts w:cs="Times New Roman"/>
                 <w:noProof/>
-                <w:szCs w:val="28"/>
                 <w:lang w:val="en-US"/>
               </w:rPr>
               <w:t>C</w:t>
@@ -563,7 +559,6 @@
                 <w:rStyle w:val="a6"/>
                 <w:rFonts w:cs="Times New Roman"/>
                 <w:noProof/>
-                <w:szCs w:val="28"/>
               </w:rPr>
               <w:t xml:space="preserve">++ в </w:t>
             </w:r>
@@ -572,7 +567,6 @@
                 <w:rStyle w:val="a6"/>
                 <w:rFonts w:cs="Times New Roman"/>
                 <w:noProof/>
-                <w:szCs w:val="28"/>
                 <w:lang w:val="en-US"/>
               </w:rPr>
               <w:t>Python</w:t>
@@ -581,7 +575,6 @@
               <w:rPr>
                 <w:noProof/>
                 <w:webHidden/>
-                <w:szCs w:val="28"/>
               </w:rPr>
               <w:tab/>
             </w:r>
@@ -589,7 +582,6 @@
               <w:rPr>
                 <w:noProof/>
                 <w:webHidden/>
-                <w:szCs w:val="28"/>
               </w:rPr>
               <w:fldChar w:fldCharType="begin"/>
             </w:r>
@@ -597,22 +589,19 @@
               <w:rPr>
                 <w:noProof/>
                 <w:webHidden/>
-                <w:szCs w:val="28"/>
-              </w:rPr>
-              <w:instrText xml:space="preserve"> PAGEREF _Toc231466059 \h </w:instrText>
-            </w:r>
-            <w:r>
-              <w:rPr>
-                <w:noProof/>
-                <w:webHidden/>
-                <w:szCs w:val="28"/>
-              </w:rPr>
-            </w:r>
-            <w:r>
-              <w:rPr>
-                <w:noProof/>
-                <w:webHidden/>
-                <w:szCs w:val="28"/>
+              </w:rPr>
+              <w:instrText xml:space="preserve"> PAGEREF _Toc231478252 \h </w:instrText>
+            </w:r>
+            <w:r>
+              <w:rPr>
+                <w:noProof/>
+                <w:webHidden/>
+              </w:rPr>
+            </w:r>
+            <w:r>
+              <w:rPr>
+                <w:noProof/>
+                <w:webHidden/>
               </w:rPr>
               <w:fldChar w:fldCharType="separate"/>
             </w:r>
@@ -620,15 +609,76 @@
               <w:rPr>
                 <w:noProof/>
                 <w:webHidden/>
-                <w:szCs w:val="28"/>
-              </w:rPr>
-              <w:t>2</w:t>
-            </w:r>
-            <w:r>
-              <w:rPr>
-                <w:noProof/>
-                <w:webHidden/>
-                <w:szCs w:val="28"/>
+              </w:rPr>
+              <w:t>3</w:t>
+            </w:r>
+            <w:r>
+              <w:rPr>
+                <w:noProof/>
+                <w:webHidden/>
+              </w:rPr>
+              <w:fldChar w:fldCharType="end"/>
+            </w:r>
+          </w:hyperlink>
+        </w:p>
+        <w:p>
+          <w:pPr>
+            <w:pStyle w:val="11"/>
+          </w:pPr>
+          <w:hyperlink w:anchor="_Toc231478253" w:history="1">
+            <w:r>
+              <w:rPr>
+                <w:rStyle w:val="a6"/>
+                <w:rFonts w:cs="Times New Roman"/>
+                <w:noProof/>
+              </w:rPr>
+              <w:t>Преобразование исполняемого файла в пайтон-байткод</w:t>
+            </w:r>
+            <w:r>
+              <w:rPr>
+                <w:noProof/>
+                <w:webHidden/>
+              </w:rPr>
+              <w:tab/>
+            </w:r>
+            <w:r>
+              <w:rPr>
+                <w:noProof/>
+                <w:webHidden/>
+              </w:rPr>
+              <w:fldChar w:fldCharType="begin"/>
+            </w:r>
+            <w:r>
+              <w:rPr>
+                <w:noProof/>
+                <w:webHidden/>
+              </w:rPr>
+              <w:instrText xml:space="preserve"> PAGEREF _Toc231478253 \h </w:instrText>
+            </w:r>
+            <w:r>
+              <w:rPr>
+                <w:noProof/>
+                <w:webHidden/>
+              </w:rPr>
+            </w:r>
+            <w:r>
+              <w:rPr>
+                <w:noProof/>
+                <w:webHidden/>
+              </w:rPr>
+              <w:fldChar w:fldCharType="separate"/>
+            </w:r>
+            <w:r>
+              <w:rPr>
+                <w:noProof/>
+                <w:webHidden/>
+              </w:rPr>
+              <w:t>4</w:t>
+            </w:r>
+            <w:r>
+              <w:rPr>
+                <w:noProof/>
+                <w:webHidden/>
               </w:rPr>
               <w:fldChar w:fldCharType="end"/>
             </w:r>
@@ -640,25 +690,24 @@
             <w:rPr>
               <w:rFonts w:asciiTheme="minorHAnsi" w:eastAsiaTheme="minorEastAsia" w:hAnsiTheme="minorHAnsi"/>
               <w:noProof/>
-              <w:szCs w:val="28"/>
+              <w:sz w:val="22"/>
               <w:lang w:eastAsia="ru-RU"/>
             </w:rPr>
           </w:pPr>
-          <w:hyperlink w:anchor="_Toc231466060" w:history="1">
+          <w:hyperlink w:anchor="_Toc231478255" w:history="1">
             <w:r>
               <w:rPr>
                 <w:rStyle w:val="a6"/>
                 <w:rFonts w:cs="Times New Roman"/>
                 <w:noProof/>
-                <w:szCs w:val="28"/>
-              </w:rPr>
-              <w:t>Распаковка программы</w:t>
-            </w:r>
-            <w:r>
-              <w:rPr>
-                <w:noProof/>
-                <w:webHidden/>
-                <w:szCs w:val="28"/>
+                <w:lang w:val="en-US"/>
+              </w:rPr>
+              <w:t>Decompyle3</w:t>
+            </w:r>
+            <w:r>
+              <w:rPr>
+                <w:noProof/>
+                <w:webHidden/>
               </w:rPr>
               <w:tab/>
             </w:r>
@@ -666,7 +715,6 @@
               <w:rPr>
                 <w:noProof/>
                 <w:webHidden/>
-                <w:szCs w:val="28"/>
               </w:rPr>
               <w:fldChar w:fldCharType="begin"/>
             </w:r>
@@ -674,33 +722,310 @@
               <w:rPr>
                 <w:noProof/>
                 <w:webHidden/>
-                <w:szCs w:val="28"/>
-              </w:rPr>
-              <w:instrText xml:space="preserve"> PAGEREF _Toc231466060 \h </w:instrText>
-            </w:r>
-            <w:r>
-              <w:rPr>
-                <w:noProof/>
-                <w:webHidden/>
-                <w:szCs w:val="28"/>
+              </w:rPr>
+              <w:instrText xml:space="preserve"> PAGEREF _Toc231478255 \h </w:instrText>
+            </w:r>
+            <w:r>
+              <w:rPr>
+                <w:noProof/>
+                <w:webHidden/>
+              </w:rPr>
+            </w:r>
+            <w:r>
+              <w:rPr>
+                <w:noProof/>
+                <w:webHidden/>
               </w:rPr>
               <w:fldChar w:fldCharType="separate"/>
             </w:r>
             <w:r>
               <w:rPr>
-                <w:b/>
-                <w:bCs/>
-                <w:noProof/>
-                <w:webHidden/>
-                <w:szCs w:val="28"/>
-              </w:rPr>
-              <w:t>Ошибка! Закладка не определена.</w:t>
-            </w:r>
-            <w:r>
-              <w:rPr>
-                <w:noProof/>
-                <w:webHidden/>
-                <w:szCs w:val="28"/>
+                <w:noProof/>
+                <w:webHidden/>
+              </w:rPr>
+              <w:t>4</w:t>
+            </w:r>
+            <w:r>
+              <w:rPr>
+                <w:noProof/>
+                <w:webHidden/>
+              </w:rPr>
+              <w:fldChar w:fldCharType="end"/>
+            </w:r>
+          </w:hyperlink>
+        </w:p>
+        <w:p>
+          <w:pPr>
+            <w:pStyle w:val="11"/>
+            <w:rPr>
+              <w:rFonts w:asciiTheme="minorHAnsi" w:eastAsiaTheme="minorEastAsia" w:hAnsiTheme="minorHAnsi"/>
+              <w:noProof/>
+              <w:sz w:val="22"/>
+              <w:lang w:eastAsia="ru-RU"/>
+            </w:rPr>
+          </w:pPr>
+          <w:hyperlink w:anchor="_Toc231478256" w:history="1">
+            <w:r>
+              <w:rPr>
+                <w:rStyle w:val="a6"/>
+                <w:rFonts w:cs="Times New Roman"/>
+                <w:noProof/>
+                <w:lang w:val="en-US"/>
+              </w:rPr>
+              <w:t>Uncompyle6</w:t>
+            </w:r>
+            <w:r>
+              <w:rPr>
+                <w:noProof/>
+                <w:webHidden/>
+              </w:rPr>
+              <w:tab/>
+            </w:r>
+            <w:r>
+              <w:rPr>
+                <w:noProof/>
+                <w:webHidden/>
+              </w:rPr>
+              <w:fldChar w:fldCharType="begin"/>
+            </w:r>
+            <w:r>
+              <w:rPr>
+                <w:noProof/>
+                <w:webHidden/>
+              </w:rPr>
+              <w:instrText xml:space="preserve"> PAGEREF _Toc231478256 \h </w:instrText>
+            </w:r>
+            <w:r>
+              <w:rPr>
+                <w:noProof/>
+                <w:webHidden/>
+              </w:rPr>
+            </w:r>
+            <w:r>
+              <w:rPr>
+                <w:noProof/>
+                <w:webHidden/>
+              </w:rPr>
+              <w:fldChar w:fldCharType="separate"/>
+            </w:r>
+            <w:r>
+              <w:rPr>
+                <w:noProof/>
+                <w:webHidden/>
+              </w:rPr>
+              <w:t>6</w:t>
+            </w:r>
+            <w:r>
+              <w:rPr>
+                <w:noProof/>
+                <w:webHidden/>
+              </w:rPr>
+              <w:fldChar w:fldCharType="end"/>
+            </w:r>
+          </w:hyperlink>
+        </w:p>
+        <w:p>
+          <w:pPr>
+            <w:pStyle w:val="11"/>
+            <w:rPr>
+              <w:rFonts w:asciiTheme="minorHAnsi" w:eastAsiaTheme="minorEastAsia" w:hAnsiTheme="minorHAnsi"/>
+              <w:noProof/>
+              <w:sz w:val="22"/>
+              <w:lang w:eastAsia="ru-RU"/>
+            </w:rPr>
+          </w:pPr>
+          <w:hyperlink w:anchor="_Toc231478257" w:history="1">
+            <w:r>
+              <w:rPr>
+                <w:rStyle w:val="a6"/>
+                <w:rFonts w:cs="Times New Roman"/>
+                <w:noProof/>
+              </w:rPr>
+              <w:t>Сравнение 4ой и 1ой лабараторных</w:t>
+            </w:r>
+            <w:r>
+              <w:rPr>
+                <w:noProof/>
+                <w:webHidden/>
+              </w:rPr>
+              <w:tab/>
+            </w:r>
+            <w:r>
+              <w:rPr>
+                <w:noProof/>
+                <w:webHidden/>
+              </w:rPr>
+              <w:fldChar w:fldCharType="begin"/>
+            </w:r>
+            <w:r>
+              <w:rPr>
+                <w:noProof/>
+                <w:webHidden/>
+              </w:rPr>
+              <w:instrText xml:space="preserve"> PAGEREF _Toc231478257 \h </w:instrText>
+            </w:r>
+            <w:r>
+              <w:rPr>
+                <w:noProof/>
+                <w:webHidden/>
+              </w:rPr>
+            </w:r>
+            <w:r>
+              <w:rPr>
+                <w:noProof/>
+                <w:webHidden/>
+              </w:rPr>
+              <w:fldChar w:fldCharType="separate"/>
+            </w:r>
+            <w:r>
+              <w:rPr>
+                <w:noProof/>
+                <w:webHidden/>
+              </w:rPr>
+              <w:t>7</w:t>
+            </w:r>
+            <w:r>
+              <w:rPr>
+                <w:noProof/>
+                <w:webHidden/>
+              </w:rPr>
+              <w:fldChar w:fldCharType="end"/>
+            </w:r>
+          </w:hyperlink>
+        </w:p>
+        <w:p>
+          <w:pPr>
+            <w:pStyle w:val="11"/>
+            <w:rPr>
+              <w:rFonts w:asciiTheme="minorHAnsi" w:eastAsiaTheme="minorEastAsia" w:hAnsiTheme="minorHAnsi"/>
+              <w:noProof/>
+              <w:sz w:val="22"/>
+              <w:lang w:eastAsia="ru-RU"/>
+            </w:rPr>
+          </w:pPr>
+          <w:hyperlink w:anchor="_Toc231478258" w:history="1">
+            <w:r>
+              <w:rPr>
+                <w:rStyle w:val="a6"/>
+                <w:rFonts w:cs="Times New Roman"/>
+                <w:noProof/>
+              </w:rPr>
+              <w:t>Фрамент двоичного кода программы</w:t>
+            </w:r>
+            <w:r>
+              <w:rPr>
+                <w:noProof/>
+                <w:webHidden/>
+              </w:rPr>
+              <w:tab/>
+            </w:r>
+            <w:r>
+              <w:rPr>
+                <w:noProof/>
+                <w:webHidden/>
+              </w:rPr>
+              <w:fldChar w:fldCharType="begin"/>
+            </w:r>
+            <w:r>
+              <w:rPr>
+                <w:noProof/>
+                <w:webHidden/>
+              </w:rPr>
+              <w:instrText xml:space="preserve"> PAGEREF _Toc231478258 \h </w:instrText>
+            </w:r>
+            <w:r>
+              <w:rPr>
+                <w:noProof/>
+                <w:webHidden/>
+              </w:rPr>
+            </w:r>
+            <w:r>
+              <w:rPr>
+                <w:noProof/>
+                <w:webHidden/>
+              </w:rPr>
+              <w:fldChar w:fldCharType="separate"/>
+            </w:r>
+            <w:r>
+              <w:rPr>
+                <w:noProof/>
+                <w:webHidden/>
+              </w:rPr>
+              <w:t>8</w:t>
+            </w:r>
+            <w:r>
+              <w:rPr>
+                <w:noProof/>
+                <w:webHidden/>
+              </w:rPr>
+              <w:fldChar w:fldCharType="end"/>
+            </w:r>
+          </w:hyperlink>
+        </w:p>
+        <w:p>
+          <w:pPr>
+            <w:pStyle w:val="11"/>
+            <w:rPr>
+              <w:rFonts w:asciiTheme="minorHAnsi" w:eastAsiaTheme="minorEastAsia" w:hAnsiTheme="minorHAnsi"/>
+              <w:noProof/>
+              <w:sz w:val="22"/>
+              <w:lang w:eastAsia="ru-RU"/>
+            </w:rPr>
+          </w:pPr>
+          <w:hyperlink w:anchor="_Toc231478260" w:history="1">
+            <w:r>
+              <w:rPr>
+                <w:rStyle w:val="a6"/>
+                <w:rFonts w:cs="Times New Roman"/>
+                <w:noProof/>
+              </w:rPr>
+              <w:t>Вывод</w:t>
+            </w:r>
+            <w:r>
+              <w:rPr>
+                <w:noProof/>
+                <w:webHidden/>
+              </w:rPr>
+              <w:tab/>
+            </w:r>
+            <w:r>
+              <w:rPr>
+                <w:noProof/>
+                <w:webHidden/>
+              </w:rPr>
+              <w:fldChar w:fldCharType="begin"/>
+            </w:r>
+            <w:r>
+              <w:rPr>
+                <w:noProof/>
+                <w:webHidden/>
+              </w:rPr>
+              <w:instrText xml:space="preserve"> PAGEREF _Toc231478260 \h </w:instrText>
+            </w:r>
+            <w:r>
+              <w:rPr>
+                <w:noProof/>
+                <w:webHidden/>
+              </w:rPr>
+            </w:r>
+            <w:r>
+              <w:rPr>
+                <w:noProof/>
+                <w:webHidden/>
+              </w:rPr>
+              <w:fldChar w:fldCharType="separate"/>
+            </w:r>
+            <w:r>
+              <w:rPr>
+                <w:noProof/>
+                <w:webHidden/>
+              </w:rPr>
+              <w:t>9</w:t>
+            </w:r>
+            <w:r>
+              <w:rPr>
+                <w:noProof/>
+                <w:webHidden/>
               </w:rPr>
               <w:fldChar w:fldCharType="end"/>
             </w:r>
@@ -764,7 +1089,7 @@
         </w:rPr>
       </w:pPr>
       <w:bookmarkStart w:id="0" w:name="_Toc231395040"/>
-      <w:bookmarkStart w:id="1" w:name="_Toc231466059"/>
+      <w:bookmarkStart w:id="1" w:name="_Toc231478252"/>
       <w:r>
         <w:rPr>
           <w:rStyle w:val="a8"/>
@@ -973,6 +1298,7 @@
           <w:szCs w:val="28"/>
         </w:rPr>
       </w:pPr>
+      <w:bookmarkStart w:id="2" w:name="_Toc231478253"/>
       <w:r>
         <w:rPr>
           <w:rStyle w:val="a8"/>
@@ -982,22 +1308,25 @@
         <w:lastRenderedPageBreak/>
         <w:t>Преобразование исполняемого файла в пайтон-байткод</w:t>
       </w:r>
-    </w:p>
-    <w:p>
-      <w:pPr>
-        <w:ind w:firstLine="0"/>
-        <w:rPr>
-          <w:rFonts w:eastAsia="Calibri" w:cs="Times New Roman"/>
-          <w:color w:val="0F1115"/>
-          <w:sz w:val="28"/>
-          <w:szCs w:val="28"/>
-          <w:shd w:val="clear" w:color="auto" w:fill="FFFFFF"/>
-        </w:rPr>
-      </w:pPr>
+      <w:bookmarkEnd w:id="2"/>
+    </w:p>
+    <w:p>
+      <w:pPr>
+        <w:ind w:firstLine="0"/>
+        <w:rPr>
+          <w:rFonts w:eastAsia="Calibri" w:cs="Times New Roman"/>
+          <w:color w:val="0F1115"/>
+          <w:sz w:val="28"/>
+          <w:szCs w:val="28"/>
+          <w:shd w:val="clear" w:color="auto" w:fill="FFFFFF"/>
+        </w:rPr>
+      </w:pPr>
+      <w:bookmarkStart w:id="3" w:name="_Toc231478254"/>
       <w:r>
         <w:rPr>
           <w:rStyle w:val="a8"/>
           <w:rFonts w:cs="Times New Roman"/>
+          <w:noProof/>
           <w:szCs w:val="28"/>
           <w:lang w:val="en-US"/>
         </w:rPr>
@@ -1037,6 +1366,7 @@
           </wp:inline>
         </w:drawing>
       </w:r>
+      <w:bookmarkEnd w:id="3"/>
     </w:p>
     <w:p>
       <w:pPr>
@@ -1126,6 +1456,7 @@
           <w:szCs w:val="28"/>
         </w:rPr>
       </w:pPr>
+      <w:bookmarkStart w:id="4" w:name="_Toc231478255"/>
       <w:r>
         <w:rPr>
           <w:rStyle w:val="a8"/>
@@ -1135,6 +1466,7 @@
         </w:rPr>
         <w:t>Decompyle3</w:t>
       </w:r>
+      <w:bookmarkEnd w:id="4"/>
     </w:p>
     <w:p>
       <w:pPr>
@@ -1147,6 +1479,7 @@
       </w:pPr>
       <w:r>
         <w:rPr>
+          <w:noProof/>
           <w:sz w:val="28"/>
           <w:szCs w:val="28"/>
           <w:lang w:val="en-US"/>
@@ -1207,7 +1540,39 @@
           <w:szCs w:val="28"/>
           <w:shd w:val="clear" w:color="auto" w:fill="FFFFFF"/>
         </w:rPr>
-        <w:t xml:space="preserve">Рисунок </w:t>
+        <w:t xml:space="preserve">Рисунок 3 – Декомпиляция объектного файла </w:t>
+      </w:r>
+      <w:r>
+        <w:rPr>
+          <w:rFonts w:eastAsia="Calibri" w:cs="Times New Roman"/>
+          <w:color w:val="0F1115"/>
+          <w:sz w:val="28"/>
+          <w:szCs w:val="28"/>
+          <w:shd w:val="clear" w:color="auto" w:fill="FFFFFF"/>
+          <w:lang w:val="en-US"/>
+        </w:rPr>
+        <w:t>Python</w:t>
+      </w:r>
+      <w:r>
+        <w:rPr>
+          <w:rFonts w:eastAsia="Calibri" w:cs="Times New Roman"/>
+          <w:color w:val="0F1115"/>
+          <w:sz w:val="28"/>
+          <w:szCs w:val="28"/>
+          <w:shd w:val="clear" w:color="auto" w:fill="FFFFFF"/>
+        </w:rPr>
+        <w:t xml:space="preserve"> с помощью </w:t>
+      </w:r>
+      <w:r>
+        <w:rPr>
+          <w:rFonts w:eastAsia="Calibri" w:cs="Times New Roman"/>
+          <w:color w:val="0F1115"/>
+          <w:sz w:val="28"/>
+          <w:szCs w:val="28"/>
+          <w:shd w:val="clear" w:color="auto" w:fill="FFFFFF"/>
+          <w:lang w:val="en-US"/>
+        </w:rPr>
+        <w:t>decompyle</w:t>
       </w:r>
       <w:r>
         <w:rPr>
@@ -1219,27 +1584,10 @@
         </w:rPr>
         <w:t>3</w:t>
       </w:r>
-      <w:r>
-        <w:rPr>
-          <w:rFonts w:eastAsia="Calibri" w:cs="Times New Roman"/>
-          <w:color w:val="0F1115"/>
-          <w:sz w:val="28"/>
-          <w:szCs w:val="28"/>
-          <w:shd w:val="clear" w:color="auto" w:fill="FFFFFF"/>
-        </w:rPr>
-        <w:t xml:space="preserve"> – </w:t>
-      </w:r>
-      <w:r>
-        <w:rPr>
-          <w:rFonts w:eastAsia="Calibri" w:cs="Times New Roman"/>
-          <w:color w:val="0F1115"/>
-          <w:sz w:val="28"/>
-          <w:szCs w:val="28"/>
-          <w:shd w:val="clear" w:color="auto" w:fill="FFFFFF"/>
-        </w:rPr>
-        <w:t xml:space="preserve">Декомпиляция объектного файла </w:t>
-      </w:r>
-      <w:r>
+    </w:p>
+    <w:p>
+      <w:pPr>
+        <w:ind w:firstLine="0"/>
         <w:rPr>
           <w:rFonts w:eastAsia="Calibri" w:cs="Times New Roman"/>
           <w:color w:val="0F1115"/>
@@ -1248,55 +1596,11 @@
           <w:shd w:val="clear" w:color="auto" w:fill="FFFFFF"/>
           <w:lang w:val="en-US"/>
         </w:rPr>
-        <w:t>Python</w:t>
-      </w:r>
-      <w:r>
-        <w:rPr>
-          <w:rFonts w:eastAsia="Calibri" w:cs="Times New Roman"/>
-          <w:color w:val="0F1115"/>
-          <w:sz w:val="28"/>
-          <w:szCs w:val="28"/>
-          <w:shd w:val="clear" w:color="auto" w:fill="FFFFFF"/>
-        </w:rPr>
-        <w:t xml:space="preserve"> с помощью </w:t>
-      </w:r>
-      <w:r>
-        <w:rPr>
-          <w:rFonts w:eastAsia="Calibri" w:cs="Times New Roman"/>
-          <w:color w:val="0F1115"/>
-          <w:sz w:val="28"/>
-          <w:szCs w:val="28"/>
-          <w:shd w:val="clear" w:color="auto" w:fill="FFFFFF"/>
-          <w:lang w:val="en-US"/>
-        </w:rPr>
-        <w:t>decompyle</w:t>
-      </w:r>
-      <w:r>
-        <w:rPr>
-          <w:rFonts w:eastAsia="Calibri" w:cs="Times New Roman"/>
-          <w:color w:val="0F1115"/>
-          <w:sz w:val="28"/>
-          <w:szCs w:val="28"/>
-          <w:shd w:val="clear" w:color="auto" w:fill="FFFFFF"/>
-        </w:rPr>
-        <w:t>3</w:t>
-      </w:r>
-    </w:p>
-    <w:p>
-      <w:pPr>
-        <w:ind w:firstLine="0"/>
-        <w:rPr>
-          <w:rFonts w:eastAsia="Calibri" w:cs="Times New Roman"/>
-          <w:color w:val="0F1115"/>
-          <w:sz w:val="28"/>
-          <w:szCs w:val="28"/>
-          <w:shd w:val="clear" w:color="auto" w:fill="FFFFFF"/>
-          <w:lang w:val="en-US"/>
-        </w:rPr>
-      </w:pPr>
-      <w:r>
-        <w:rPr>
-          <w:rFonts w:eastAsia="Calibri" w:cs="Times New Roman"/>
+      </w:pPr>
+      <w:r>
+        <w:rPr>
+          <w:rFonts w:eastAsia="Calibri" w:cs="Times New Roman"/>
+          <w:noProof/>
           <w:color w:val="0F1115"/>
           <w:sz w:val="28"/>
           <w:szCs w:val="28"/>
@@ -1378,17 +1682,7 @@
           <w:szCs w:val="28"/>
           <w:shd w:val="clear" w:color="auto" w:fill="FFFFFF"/>
         </w:rPr>
-        <w:t xml:space="preserve"> – </w:t>
-      </w:r>
-      <w:r>
-        <w:rPr>
-          <w:rFonts w:eastAsia="Calibri" w:cs="Times New Roman"/>
-          <w:color w:val="0F1115"/>
-          <w:sz w:val="28"/>
-          <w:szCs w:val="28"/>
-          <w:shd w:val="clear" w:color="auto" w:fill="FFFFFF"/>
-        </w:rPr>
-        <w:t xml:space="preserve">Байт-код полученный после применения </w:t>
+        <w:t xml:space="preserve"> – Байт-код полученный после применения </w:t>
       </w:r>
       <w:r>
         <w:rPr>
@@ -1434,6 +1728,7 @@
       </w:pPr>
       <w:r>
         <w:rPr>
+          <w:noProof/>
           <w:sz w:val="28"/>
           <w:szCs w:val="28"/>
         </w:rPr>
@@ -1578,6 +1873,7 @@
         </w:rPr>
         <w:br w:type="page"/>
       </w:r>
+      <w:bookmarkStart w:id="5" w:name="_Toc231478256"/>
       <w:r>
         <w:rPr>
           <w:rStyle w:val="a8"/>
@@ -1588,17 +1884,19 @@
         <w:lastRenderedPageBreak/>
         <w:t>Uncompyle6</w:t>
       </w:r>
-    </w:p>
-    <w:p>
-      <w:pPr>
-        <w:ind w:firstLine="0"/>
-        <w:rPr>
-          <w:sz w:val="28"/>
-          <w:szCs w:val="28"/>
-        </w:rPr>
-      </w:pPr>
-      <w:r>
-        <w:rPr>
+      <w:bookmarkEnd w:id="5"/>
+    </w:p>
+    <w:p>
+      <w:pPr>
+        <w:ind w:firstLine="0"/>
+        <w:rPr>
+          <w:sz w:val="28"/>
+          <w:szCs w:val="28"/>
+        </w:rPr>
+      </w:pPr>
+      <w:r>
+        <w:rPr>
+          <w:noProof/>
           <w:sz w:val="28"/>
           <w:szCs w:val="28"/>
         </w:rPr>
@@ -1658,7 +1956,39 @@
           <w:szCs w:val="28"/>
           <w:shd w:val="clear" w:color="auto" w:fill="FFFFFF"/>
         </w:rPr>
-        <w:t xml:space="preserve">Рисунок </w:t>
+        <w:t xml:space="preserve">Рисунок 6 – Декомпиляция объектного файла </w:t>
+      </w:r>
+      <w:r>
+        <w:rPr>
+          <w:rFonts w:eastAsia="Calibri" w:cs="Times New Roman"/>
+          <w:color w:val="0F1115"/>
+          <w:sz w:val="28"/>
+          <w:szCs w:val="28"/>
+          <w:shd w:val="clear" w:color="auto" w:fill="FFFFFF"/>
+          <w:lang w:val="en-US"/>
+        </w:rPr>
+        <w:t>Python</w:t>
+      </w:r>
+      <w:r>
+        <w:rPr>
+          <w:rFonts w:eastAsia="Calibri" w:cs="Times New Roman"/>
+          <w:color w:val="0F1115"/>
+          <w:sz w:val="28"/>
+          <w:szCs w:val="28"/>
+          <w:shd w:val="clear" w:color="auto" w:fill="FFFFFF"/>
+        </w:rPr>
+        <w:t xml:space="preserve"> с помощью </w:t>
+      </w:r>
+      <w:r>
+        <w:rPr>
+          <w:rFonts w:eastAsia="Calibri" w:cs="Times New Roman"/>
+          <w:color w:val="0F1115"/>
+          <w:sz w:val="28"/>
+          <w:szCs w:val="28"/>
+          <w:shd w:val="clear" w:color="auto" w:fill="FFFFFF"/>
+          <w:lang w:val="en-US"/>
+        </w:rPr>
+        <w:t>uncompyle</w:t>
       </w:r>
       <w:r>
         <w:rPr>
@@ -1670,73 +2000,22 @@
         </w:rPr>
         <w:t>6</w:t>
       </w:r>
-      <w:r>
-        <w:rPr>
-          <w:rFonts w:eastAsia="Calibri" w:cs="Times New Roman"/>
-          <w:color w:val="0F1115"/>
-          <w:sz w:val="28"/>
-          <w:szCs w:val="28"/>
-          <w:shd w:val="clear" w:color="auto" w:fill="FFFFFF"/>
-        </w:rPr>
-        <w:t xml:space="preserve"> – Декомпиляция объектного файла </w:t>
-      </w:r>
-      <w:r>
-        <w:rPr>
-          <w:rFonts w:eastAsia="Calibri" w:cs="Times New Roman"/>
-          <w:color w:val="0F1115"/>
-          <w:sz w:val="28"/>
-          <w:szCs w:val="28"/>
-          <w:shd w:val="clear" w:color="auto" w:fill="FFFFFF"/>
-          <w:lang w:val="en-US"/>
-        </w:rPr>
-        <w:t>Python</w:t>
-      </w:r>
-      <w:r>
-        <w:rPr>
-          <w:rFonts w:eastAsia="Calibri" w:cs="Times New Roman"/>
-          <w:color w:val="0F1115"/>
-          <w:sz w:val="28"/>
-          <w:szCs w:val="28"/>
-          <w:shd w:val="clear" w:color="auto" w:fill="FFFFFF"/>
-        </w:rPr>
-        <w:t xml:space="preserve"> с помощью </w:t>
-      </w:r>
-      <w:r>
-        <w:rPr>
-          <w:rFonts w:eastAsia="Calibri" w:cs="Times New Roman"/>
-          <w:color w:val="0F1115"/>
-          <w:sz w:val="28"/>
-          <w:szCs w:val="28"/>
-          <w:shd w:val="clear" w:color="auto" w:fill="FFFFFF"/>
-          <w:lang w:val="en-US"/>
-        </w:rPr>
-        <w:t>uncompyle</w:t>
-      </w:r>
-      <w:r>
-        <w:rPr>
-          <w:rFonts w:eastAsia="Calibri" w:cs="Times New Roman"/>
-          <w:color w:val="0F1115"/>
-          <w:sz w:val="28"/>
-          <w:szCs w:val="28"/>
-          <w:shd w:val="clear" w:color="auto" w:fill="FFFFFF"/>
-        </w:rPr>
-        <w:t>6</w:t>
-      </w:r>
-    </w:p>
-    <w:p>
-      <w:pPr>
-        <w:ind w:firstLine="0"/>
-        <w:rPr>
-          <w:rFonts w:eastAsia="Calibri" w:cs="Times New Roman"/>
-          <w:color w:val="0F1115"/>
-          <w:sz w:val="28"/>
-          <w:szCs w:val="28"/>
-          <w:shd w:val="clear" w:color="auto" w:fill="FFFFFF"/>
-        </w:rPr>
-      </w:pPr>
-      <w:r>
-        <w:rPr>
-          <w:rFonts w:eastAsia="Calibri" w:cs="Times New Roman"/>
+    </w:p>
+    <w:p>
+      <w:pPr>
+        <w:ind w:firstLine="0"/>
+        <w:rPr>
+          <w:rFonts w:eastAsia="Calibri" w:cs="Times New Roman"/>
+          <w:color w:val="0F1115"/>
+          <w:sz w:val="28"/>
+          <w:szCs w:val="28"/>
+          <w:shd w:val="clear" w:color="auto" w:fill="FFFFFF"/>
+        </w:rPr>
+      </w:pPr>
+      <w:r>
+        <w:rPr>
+          <w:rFonts w:eastAsia="Calibri" w:cs="Times New Roman"/>
+          <w:noProof/>
           <w:color w:val="0F1115"/>
           <w:sz w:val="28"/>
           <w:szCs w:val="28"/>
@@ -1798,27 +2077,7 @@
           <w:szCs w:val="28"/>
           <w:shd w:val="clear" w:color="auto" w:fill="FFFFFF"/>
         </w:rPr>
-        <w:t xml:space="preserve">Рисунок </w:t>
-      </w:r>
-      <w:r>
-        <w:rPr>
-          <w:rFonts w:eastAsia="Calibri" w:cs="Times New Roman"/>
-          <w:color w:val="0F1115"/>
-          <w:sz w:val="28"/>
-          <w:szCs w:val="28"/>
-          <w:shd w:val="clear" w:color="auto" w:fill="FFFFFF"/>
-        </w:rPr>
-        <w:t xml:space="preserve">7 </w:t>
-      </w:r>
-      <w:r>
-        <w:rPr>
-          <w:rFonts w:eastAsia="Calibri" w:cs="Times New Roman"/>
-          <w:color w:val="0F1115"/>
-          <w:sz w:val="28"/>
-          <w:szCs w:val="28"/>
-          <w:shd w:val="clear" w:color="auto" w:fill="FFFFFF"/>
-        </w:rPr>
-        <w:t xml:space="preserve">– Декомпилированный исходный код после применения </w:t>
+        <w:t xml:space="preserve">Рисунок 7 – Декомпилированный исходный код после применения </w:t>
       </w:r>
       <w:r>
         <w:rPr>
@@ -1878,6 +2137,7 @@
           <w:szCs w:val="28"/>
         </w:rPr>
       </w:pPr>
+      <w:bookmarkStart w:id="6" w:name="_Toc231478257"/>
       <w:r>
         <w:rPr>
           <w:rStyle w:val="a8"/>
@@ -1887,6 +2147,7 @@
         <w:lastRenderedPageBreak/>
         <w:t>Сравнение 4ой и 1ой лабараторных</w:t>
       </w:r>
+      <w:bookmarkEnd w:id="6"/>
     </w:p>
     <w:p>
       <w:pPr>
@@ -2025,6 +2286,7 @@
       <w:r>
         <w:rPr>
           <w:rFonts w:eastAsia="Calibri" w:cs="Times New Roman"/>
+          <w:noProof/>
           <w:color w:val="0F1115"/>
           <w:sz w:val="28"/>
           <w:szCs w:val="28"/>
@@ -2076,7 +2338,6 @@
           <w:sz w:val="28"/>
           <w:szCs w:val="28"/>
           <w:shd w:val="clear" w:color="auto" w:fill="FFFFFF"/>
-          <w:lang w:val="en-US"/>
         </w:rPr>
       </w:pPr>
       <w:r>
@@ -2141,6 +2402,7 @@
           <w:szCs w:val="28"/>
         </w:rPr>
       </w:pPr>
+      <w:bookmarkStart w:id="7" w:name="_Toc231478258"/>
       <w:r>
         <w:rPr>
           <w:rStyle w:val="a8"/>
@@ -2149,24 +2411,29 @@
         </w:rPr>
         <w:t>Фрамент двоичного кода программы</w:t>
       </w:r>
-    </w:p>
-    <w:p>
-      <w:pPr>
-        <w:ind w:firstLine="0"/>
+      <w:bookmarkEnd w:id="7"/>
+    </w:p>
+    <w:p>
+      <w:pPr>
+        <w:ind w:firstLine="0"/>
+        <w:rPr>
+          <w:rFonts w:eastAsia="Calibri" w:cs="Times New Roman"/>
+          <w:color w:val="0F1115"/>
+          <w:sz w:val="28"/>
+          <w:szCs w:val="28"/>
+          <w:shd w:val="clear" w:color="auto" w:fill="FFFFFF"/>
+        </w:rPr>
+      </w:pPr>
+      <w:bookmarkStart w:id="8" w:name="_Toc231478259"/>
+      <w:r>
         <w:rPr>
           <w:rStyle w:val="a8"/>
           <w:rFonts w:cs="Times New Roman"/>
-          <w:szCs w:val="28"/>
-        </w:rPr>
-      </w:pPr>
-      <w:r>
-        <w:rPr>
-          <w:rStyle w:val="a8"/>
-          <w:rFonts w:cs="Times New Roman"/>
+          <w:noProof/>
           <w:szCs w:val="28"/>
         </w:rPr>
         <w:drawing>
-          <wp:inline distT="0" distB="0" distL="0" distR="0" wp14:anchorId="6AAA227A" wp14:editId="1731A042">
+          <wp:inline distT="0" distB="0" distL="0" distR="0" wp14:anchorId="3A2D570A" wp14:editId="56C65AE5">
             <wp:extent cx="5940425" cy="3136900"/>
             <wp:effectExtent l="0" t="0" r="3175" b="6350"/>
             <wp:docPr id="13" name="Рисунок 13"/>
@@ -2201,6 +2468,7 @@
           </wp:inline>
         </w:drawing>
       </w:r>
+      <w:bookmarkEnd w:id="8"/>
     </w:p>
     <w:p>
       <w:pPr>
@@ -2368,6 +2636,7 @@
           <w:szCs w:val="28"/>
         </w:rPr>
       </w:pPr>
+      <w:bookmarkStart w:id="9" w:name="_Toc231478260"/>
       <w:r>
         <w:rPr>
           <w:rStyle w:val="a8"/>
@@ -2376,6 +2645,7 @@
         </w:rPr>
         <w:t>Вывод</w:t>
       </w:r>
+      <w:bookmarkEnd w:id="9"/>
     </w:p>
     <w:p>
       <w:pPr>
@@ -3401,7 +3671,6 @@
   <w:style w:type="character" w:default="1" w:styleId="a0">
     <w:name w:val="Default Paragraph Font"/>
     <w:uiPriority w:val="1"/>
-    <w:semiHidden/>
     <w:unhideWhenUsed/>
   </w:style>
   <w:style w:type="table" w:default="1" w:styleId="a1">
@@ -4022,6 +4291,23 @@
 </file>
 
 <file path=customXml/item2.xml><?xml version="1.0" encoding="utf-8"?>
+<p:properties xmlns:p="http://schemas.microsoft.com/office/2006/metadata/properties" xmlns:xsi="http://www.w3.org/2001/XMLSchema-instance" xmlns:pc="http://schemas.microsoft.com/office/infopath/2007/PartnerControls">
+  <documentManagement>
+    <ReferenceId xmlns="aa959d31-8759-406f-8f75-7497590a0733" xsi:nil="true"/>
+  </documentManagement>
+</p:properties>
+</file>
+
+<file path=customXml/item3.xml><?xml version="1.0" encoding="utf-8"?>
+<?mso-contentType ?>
+<FormTemplates xmlns="http://schemas.microsoft.com/sharepoint/v3/contenttype/forms">
+  <Display>DocumentLibraryForm</Display>
+  <Edit>DocumentLibraryForm</Edit>
+  <New>DocumentLibraryForm</New>
+</FormTemplates>
+</file>
+
+<file path=customXml/item4.xml><?xml version="1.0" encoding="utf-8"?>
 <ct:contentTypeSchema xmlns:ct="http://schemas.microsoft.com/office/2006/metadata/contentType" xmlns:ma="http://schemas.microsoft.com/office/2006/metadata/properties/metaAttributes" ct:_="" ma:_="" ma:contentTypeName="Документ" ma:contentTypeID="0x010100BE59C381F157584E847F40BF3D5760D4" ma:contentTypeVersion="9" ma:contentTypeDescription="Создание документа." ma:contentTypeScope="" ma:versionID="ce870ca18754169408a4d8a23e458b04">
   <xsd:schema xmlns:xsd="http://www.w3.org/2001/XMLSchema" xmlns:xs="http://www.w3.org/2001/XMLSchema" xmlns:p="http://schemas.microsoft.com/office/2006/metadata/properties" xmlns:ns2="aa959d31-8759-406f-8f75-7497590a0733" targetNamespace="http://schemas.microsoft.com/office/2006/metadata/properties" ma:root="true" ma:fieldsID="21309b88f8dccf7a8e7e9fe3f72ab1f7" ns2:_="">
     <xsd:import namespace="aa959d31-8759-406f-8f75-7497590a0733"/>
@@ -4195,23 +4481,6 @@
 </ct:contentTypeSchema>
 </file>
 
-<file path=customXml/item3.xml><?xml version="1.0" encoding="utf-8"?>
-<?mso-contentType ?>
-<FormTemplates xmlns="http://schemas.microsoft.com/sharepoint/v3/contenttype/forms">
-  <Display>DocumentLibraryForm</Display>
-  <Edit>DocumentLibraryForm</Edit>
-  <New>DocumentLibraryForm</New>
-</FormTemplates>
-</file>
-
-<file path=customXml/item4.xml><?xml version="1.0" encoding="utf-8"?>
-<p:properties xmlns:p="http://schemas.microsoft.com/office/2006/metadata/properties" xmlns:xsi="http://www.w3.org/2001/XMLSchema-instance" xmlns:pc="http://schemas.microsoft.com/office/infopath/2007/PartnerControls">
-  <documentManagement>
-    <ReferenceId xmlns="aa959d31-8759-406f-8f75-7497590a0733" xsi:nil="true"/>
-  </documentManagement>
-</p:properties>
-</file>
-
 <file path=customXml/itemProps1.xml><?xml version="1.0" encoding="utf-8"?>
 <ds:datastoreItem xmlns:ds="http://schemas.openxmlformats.org/officeDocument/2006/customXml" ds:itemID="{2DC4A3D6-E344-40E0-8557-86E5EBCD0986}">
   <ds:schemaRefs>
@@ -4221,6 +4490,24 @@
 </file>
 
 <file path=customXml/itemProps2.xml><?xml version="1.0" encoding="utf-8"?>
+<ds:datastoreItem xmlns:ds="http://schemas.openxmlformats.org/officeDocument/2006/customXml" ds:itemID="{6E7C0F4C-F014-4BA6-B01A-54786F37D04E}">
+  <ds:schemaRefs>
+    <ds:schemaRef ds:uri="http://schemas.microsoft.com/office/2006/metadata/properties"/>
+    <ds:schemaRef ds:uri="http://schemas.microsoft.com/office/infopath/2007/PartnerControls"/>
+    <ds:schemaRef ds:uri="aa959d31-8759-406f-8f75-7497590a0733"/>
+  </ds:schemaRefs>
+</ds:datastoreItem>
+</file>
+
+<file path=customXml/itemProps3.xml><?xml version="1.0" encoding="utf-8"?>
+<ds:datastoreItem xmlns:ds="http://schemas.openxmlformats.org/officeDocument/2006/customXml" ds:itemID="{E41A4599-5C30-43B1-8928-D54C6A2B4AA7}">
+  <ds:schemaRefs>
+    <ds:schemaRef ds:uri="http://schemas.microsoft.com/sharepoint/v3/contenttype/forms"/>
+  </ds:schemaRefs>
+</ds:datastoreItem>
+</file>
+
+<file path=customXml/itemProps4.xml><?xml version="1.0" encoding="utf-8"?>
 <ds:datastoreItem xmlns:ds="http://schemas.openxmlformats.org/officeDocument/2006/customXml" ds:itemID="{03407D4D-C0A9-41A7-80F0-4E6649605212}">
   <ds:schemaRefs>
     <ds:schemaRef ds:uri="http://schemas.microsoft.com/office/2006/metadata/contentType"/>
@@ -4236,22 +4523,4 @@
     <ds:schemaRef ds:uri="http://schemas.microsoft.com/internal/obd"/>
   </ds:schemaRefs>
 </ds:datastoreItem>
-</file>
-
-<file path=customXml/itemProps3.xml><?xml version="1.0" encoding="utf-8"?>
-<ds:datastoreItem xmlns:ds="http://schemas.openxmlformats.org/officeDocument/2006/customXml" ds:itemID="{E41A4599-5C30-43B1-8928-D54C6A2B4AA7}">
-  <ds:schemaRefs>
-    <ds:schemaRef ds:uri="http://schemas.microsoft.com/sharepoint/v3/contenttype/forms"/>
-  </ds:schemaRefs>
-</ds:datastoreItem>
-</file>
-
-<file path=customXml/itemProps4.xml><?xml version="1.0" encoding="utf-8"?>
-<ds:datastoreItem xmlns:ds="http://schemas.openxmlformats.org/officeDocument/2006/customXml" ds:itemID="{6E7C0F4C-F014-4BA6-B01A-54786F37D04E}">
-  <ds:schemaRefs>
-    <ds:schemaRef ds:uri="http://schemas.microsoft.com/office/2006/metadata/properties"/>
-    <ds:schemaRef ds:uri="http://schemas.microsoft.com/office/infopath/2007/PartnerControls"/>
-    <ds:schemaRef ds:uri="aa959d31-8759-406f-8f75-7497590a0733"/>
-  </ds:schemaRefs>
-</ds:datastoreItem>
 </file>
</xml_diff>

<commit_message>
Add size of file screen to report 3,4
</commit_message>
<xml_diff>
--- a/Задание 4 Python/Лр4_Python_Мавзовин_Пётр_ТКИ341.docx
+++ b/Задание 4 Python/Лр4_Python_Мавзовин_Пётр_ТКИ341.docx
@@ -2906,6 +2906,7 @@
           <w:sz w:val="28"/>
           <w:szCs w:val="28"/>
           <w:shd w:val="clear" w:color="auto" w:fill="FFFFFF"/>
+          <w:lang w:val="en-US"/>
         </w:rPr>
       </w:pPr>
       <w:r>
@@ -2961,6 +2962,182 @@
           <w:shd w:val="clear" w:color="auto" w:fill="FFFFFF"/>
         </w:rPr>
         <w:t xml:space="preserve">Общая энтропия файла в </w:t>
+      </w:r>
+      <w:r>
+        <w:rPr>
+          <w:color w:val="0F1115"/>
+          <w:sz w:val="28"/>
+          <w:szCs w:val="28"/>
+          <w:shd w:val="clear" w:color="auto" w:fill="FFFFFF"/>
+          <w:lang w:val="en-US"/>
+        </w:rPr>
+        <w:t>DIE</w:t>
+      </w:r>
+    </w:p>
+    <w:p>
+      <w:pPr>
+        <w:pStyle w:val="a9"/>
+        <w:rPr>
+          <w:color w:val="0F1115"/>
+          <w:sz w:val="28"/>
+          <w:szCs w:val="28"/>
+          <w:shd w:val="clear" w:color="auto" w:fill="FFFFFF"/>
+        </w:rPr>
+      </w:pPr>
+      <w:r>
+        <w:rPr>
+          <w:color w:val="0F1115"/>
+          <w:sz w:val="28"/>
+          <w:szCs w:val="28"/>
+          <w:shd w:val="clear" w:color="auto" w:fill="FFFFFF"/>
+        </w:rPr>
+        <w:drawing>
+          <wp:inline distT="0" distB="0" distL="0" distR="0" wp14:anchorId="57CE7030" wp14:editId="28F67FAD">
+            <wp:extent cx="5940425" cy="979170"/>
+            <wp:effectExtent l="0" t="0" r="3175" b="0"/>
+            <wp:docPr id="16" name="Рисунок 16"/>
+            <wp:cNvGraphicFramePr>
+              <a:graphicFrameLocks xmlns:a="http://schemas.openxmlformats.org/drawingml/2006/main" noChangeAspect="1"/>
+            </wp:cNvGraphicFramePr>
+            <a:graphic xmlns:a="http://schemas.openxmlformats.org/drawingml/2006/main">
+              <a:graphicData uri="http://schemas.openxmlformats.org/drawingml/2006/picture">
+                <pic:pic xmlns:pic="http://schemas.openxmlformats.org/drawingml/2006/picture">
+                  <pic:nvPicPr>
+                    <pic:cNvPr id="1" name=""/>
+                    <pic:cNvPicPr/>
+                  </pic:nvPicPr>
+                  <pic:blipFill>
+                    <a:blip r:embed="rId23"/>
+                    <a:stretch>
+                      <a:fillRect/>
+                    </a:stretch>
+                  </pic:blipFill>
+                  <pic:spPr>
+                    <a:xfrm>
+                      <a:off x="0" y="0"/>
+                      <a:ext cx="5940425" cy="979170"/>
+                    </a:xfrm>
+                    <a:prstGeom prst="rect">
+                      <a:avLst/>
+                    </a:prstGeom>
+                  </pic:spPr>
+                </pic:pic>
+              </a:graphicData>
+            </a:graphic>
+          </wp:inline>
+        </w:drawing>
+      </w:r>
+    </w:p>
+    <w:p>
+      <w:pPr>
+        <w:pStyle w:val="a9"/>
+        <w:rPr>
+          <w:color w:val="0F1115"/>
+          <w:sz w:val="28"/>
+          <w:szCs w:val="28"/>
+          <w:shd w:val="clear" w:color="auto" w:fill="FFFFFF"/>
+        </w:rPr>
+      </w:pPr>
+      <w:r>
+        <w:rPr>
+          <w:color w:val="0F1115"/>
+          <w:sz w:val="28"/>
+          <w:szCs w:val="28"/>
+          <w:shd w:val="clear" w:color="auto" w:fill="FFFFFF"/>
+        </w:rPr>
+        <w:t xml:space="preserve">Рисунок </w:t>
+      </w:r>
+      <w:r>
+        <w:rPr>
+          <w:color w:val="0F1115"/>
+          <w:sz w:val="28"/>
+          <w:szCs w:val="28"/>
+          <w:shd w:val="clear" w:color="auto" w:fill="FFFFFF"/>
+        </w:rPr>
+        <w:t>1</w:t>
+      </w:r>
+      <w:r>
+        <w:rPr>
+          <w:color w:val="0F1115"/>
+          <w:sz w:val="28"/>
+          <w:szCs w:val="28"/>
+          <w:shd w:val="clear" w:color="auto" w:fill="FFFFFF"/>
+        </w:rPr>
+        <w:t>3</w:t>
+      </w:r>
+      <w:r>
+        <w:rPr>
+          <w:color w:val="0F1115"/>
+          <w:sz w:val="28"/>
+          <w:szCs w:val="28"/>
+          <w:shd w:val="clear" w:color="auto" w:fill="FFFFFF"/>
+        </w:rPr>
+        <w:t xml:space="preserve"> –</w:t>
+      </w:r>
+      <w:r>
+        <w:rPr>
+          <w:color w:val="0F1115"/>
+          <w:sz w:val="28"/>
+          <w:szCs w:val="28"/>
+          <w:shd w:val="clear" w:color="auto" w:fill="FFFFFF"/>
+        </w:rPr>
+        <w:t xml:space="preserve"> </w:t>
+      </w:r>
+      <w:r>
+        <w:rPr>
+          <w:color w:val="0F1115"/>
+          <w:sz w:val="28"/>
+          <w:szCs w:val="28"/>
+          <w:shd w:val="clear" w:color="auto" w:fill="FFFFFF"/>
+        </w:rPr>
+        <w:t>Размер файла (</w:t>
+      </w:r>
+      <w:r>
+        <w:rPr>
+          <w:color w:val="0F1115"/>
+          <w:sz w:val="28"/>
+          <w:szCs w:val="28"/>
+          <w:shd w:val="clear" w:color="auto" w:fill="FFFFFF"/>
+          <w:lang w:val="en-US"/>
+        </w:rPr>
+        <w:t>0x</w:t>
+      </w:r>
+      <w:r>
+        <w:rPr>
+          <w:color w:val="0F1115"/>
+          <w:sz w:val="28"/>
+          <w:szCs w:val="28"/>
+          <w:shd w:val="clear" w:color="auto" w:fill="FFFFFF"/>
+        </w:rPr>
+        <w:t>4</w:t>
+      </w:r>
+      <w:r>
+        <w:rPr>
+          <w:color w:val="0F1115"/>
+          <w:sz w:val="28"/>
+          <w:szCs w:val="28"/>
+          <w:shd w:val="clear" w:color="auto" w:fill="FFFFFF"/>
+          <w:lang w:val="en-US"/>
+        </w:rPr>
+        <w:t>e200 +0x4dfdde</w:t>
+      </w:r>
+      <w:r>
+        <w:rPr>
+          <w:color w:val="0F1115"/>
+          <w:sz w:val="28"/>
+          <w:szCs w:val="28"/>
+          <w:shd w:val="clear" w:color="auto" w:fill="FFFFFF"/>
+        </w:rPr>
+        <w:t>)</w:t>
+      </w:r>
+      <w:r>
+        <w:rPr>
+          <w:color w:val="0F1115"/>
+          <w:sz w:val="28"/>
+          <w:szCs w:val="28"/>
+          <w:shd w:val="clear" w:color="auto" w:fill="FFFFFF"/>
+        </w:rPr>
+        <w:t xml:space="preserve"> в </w:t>
       </w:r>
       <w:r>
         <w:rPr>

</xml_diff>